<commit_message>
make a wide version with PCs and run slopeint models with PCs. also run mlVAR with PCs for V1 and V2.
</commit_message>
<xml_diff>
--- a/paper/Methods.docx
+++ b/paper/Methods.docx
@@ -1113,6 +1113,30 @@
         </w:rPr>
         <w:t>phq2_2 -&gt; phq2_1 0.08 higher in nondepressed group / 0.08 lower in depressed group</w:t>
       </w:r>
+    </w:p>
+    <w:p>
+      <w:pPr>
+        <w:rPr>
+          <w:sz w:val="30"/>
+          <w:szCs w:val="30"/>
+        </w:rPr>
+      </w:pPr>
+    </w:p>
+    <w:p>
+      <w:pPr>
+        <w:rPr>
+          <w:sz w:val="30"/>
+          <w:szCs w:val="30"/>
+        </w:rPr>
+      </w:pPr>
+    </w:p>
+    <w:p>
+      <w:pPr>
+        <w:rPr>
+          <w:sz w:val="30"/>
+          <w:szCs w:val="30"/>
+        </w:rPr>
+      </w:pPr>
     </w:p>
     <w:sectPr>
       <w:pgSz w:w="12240" w:h="15840"/>
@@ -2527,7 +2551,7 @@
 </file>
 
 <file path=customXml/itemProps1.xml><?xml version="1.0" encoding="utf-8"?>
-<ds:datastoreItem xmlns:ds="http://schemas.openxmlformats.org/officeDocument/2006/customXml" ds:itemID="{B9DC4ACD-BC17-7441-9DE8-8B30C14F0A88}">
+<ds:datastoreItem xmlns:ds="http://schemas.openxmlformats.org/officeDocument/2006/customXml" ds:itemID="{32202FE1-33BA-E047-A9A4-DB63C8C878D0}">
   <ds:schemaRefs>
     <ds:schemaRef ds:uri="http://schemas.openxmlformats.org/officeDocument/2006/bibliography"/>
   </ds:schemaRefs>

</xml_diff>